<commit_message>
Fix STROBE figure/table page detection and avoid OMML math in Health Policy docx
- Anchor STROBE caption detection to start-of-line so figure page numbers point to captions, not in-text mentions.

- Remove convert_docx_math_to_omml conversion; use plain Unicode beta and Word-native superscript for R2 so text extraction and word counts are reliable.

- Trim abstract Results to stay within the 250-word structured abstract limit.

- Rebuild submission package: abstract 231 words, body 3266 words.

Co-Authored-By: Tatsuki Onishi <bougtoir@gmail.com>
</commit_message>
<xml_diff>
--- a/documents/Health_Policy/regional_anaesthesia_Health_Policy_EN.docx
+++ b/documents/Health_Policy/regional_anaesthesia_Health_Policy_EN.docx
@@ -69,7 +69,7 @@
           <w:i/>
           <w:sz w:val="24"/>
         </w:rPr>
-        <w:t>Word count (main text, excluding abstract, references, tables and figures): approximately 3144 words</w:t>
+        <w:t>Word count (main text, excluding abstract, references, tables and figures): approximately 3266 words</w:t>
       </w:r>
     </w:p>
     <w:p>
@@ -181,97 +181,7 @@
           <w:rFonts w:ascii="Times New Roman" w:hAnsi="Times New Roman"/>
           <w:sz w:val="24"/>
         </w:rPr>
-        <w:t>Results: Coefficients of variation among the four primary codes ranged from 53.7% to 87.2%. For general anaesthesia, only 0.058 of variance lay between prefectures; university hospital presence explained 0.358 of total variance (</w:t>
-      </w:r>
-      <m:oMath>
-        <m:r>
-          <m:t xml:space="preserve">β </m:t>
-        </m:r>
-        <m:r>
-          <m:t xml:space="preserve">= </m:t>
-        </m:r>
-        <m:r>
-          <m:t xml:space="preserve">64.1</m:t>
-        </m:r>
-        <m:r>
-          <m:t xml:space="preserve">, </m:t>
-        </m:r>
-        <m:r>
-          <m:t xml:space="preserve">95% CI </m:t>
-        </m:r>
-        <m:r>
-          <m:t xml:space="preserve">54.8 </m:t>
-        </m:r>
-        <m:r>
-          <m:t xml:space="preserve">to </m:t>
-        </m:r>
-        <m:r>
-          <m:t xml:space="preserve">73.4</m:t>
-        </m:r>
-        <m:r>
-          <m:t xml:space="preserve">, </m:t>
-        </m:r>
-        <m:r>
-          <m:t xml:space="preserve">P </m:t>
-        </m:r>
-        <m:r>
-          <m:t xml:space="preserve">&lt;</m:t>
-        </m:r>
-        <m:r>
-          <m:t xml:space="preserve">0.001</m:t>
-        </m:r>
-      </m:oMath>
-      <w:r>
-        <w:rPr>
-          <w:rFonts w:ascii="Times New Roman" w:hAnsi="Times New Roman"/>
-          <w:sz w:val="24"/>
-        </w:rPr>
-        <w:t>). The association persisted with log-transformed ratios (</w:t>
-      </w:r>
-      <m:oMath>
-        <m:r>
-          <m:t xml:space="preserve">β </m:t>
-        </m:r>
-        <m:r>
-          <m:t xml:space="preserve">= </m:t>
-        </m:r>
-        <m:r>
-          <m:t xml:space="preserve">0.75</m:t>
-        </m:r>
-        <m:r>
-          <m:t xml:space="preserve">, </m:t>
-        </m:r>
-        <m:r>
-          <m:t xml:space="preserve">95% CI </m:t>
-        </m:r>
-        <m:r>
-          <m:t xml:space="preserve">0.61 </m:t>
-        </m:r>
-        <m:r>
-          <m:t xml:space="preserve">to </m:t>
-        </m:r>
-        <m:r>
-          <m:t xml:space="preserve">0.89</m:t>
-        </m:r>
-        <m:r>
-          <m:t xml:space="preserve">, </m:t>
-        </m:r>
-        <m:r>
-          <m:t xml:space="preserve">P </m:t>
-        </m:r>
-        <m:r>
-          <m:t xml:space="preserve">&lt;</m:t>
-        </m:r>
-        <m:r>
-          <m:t xml:space="preserve">0.001</m:t>
-        </m:r>
-      </m:oMath>
-      <w:r>
-        <w:rPr>
-          <w:rFonts w:ascii="Times New Roman" w:hAnsi="Times New Roman"/>
-          <w:sz w:val="24"/>
-        </w:rPr>
-        <w:t>). Maximum plausible audit-related ratio shifts were small relative to the observed interquartile range. Covariate adjustment attenuated but did not eliminate the university-hospital effect for general, epidural and continuous epidural anaesthesia.</w:t>
+        <w:t>Results: Coefficients of variation ranged from 53.7% to 87.2%. For general anaesthesia, only 0.058 of variance lay between prefectures; university hospital presence explained 0.358 of total variance (P &lt;0.001). The association persisted after log transformation and covariate adjustment; audit-related ratio shifts were small relative to observed variation, supporting structural access over differential auditing.</w:t>
       </w:r>
     </w:p>
     <w:p>
@@ -625,22 +535,16 @@
           <w:rFonts w:ascii="Times New Roman" w:hAnsi="Times New Roman"/>
           <w:sz w:val="24"/>
         </w:rPr>
-        <w:t xml:space="preserve">We computed descriptive statistics for each standardised claim ratio (mean, standard deviation, median, interquartile range, minimum, maximum and coefficient of variation). To account for the nesting of secondary medical areas within prefectures, we fitted multilevel linear models with prefecture random intercepts and a binary fixed effect for university hospital presence, using restricted maximum likelihood. The null model intraclass correlation coefficient quantified the proportion of variance between prefectures, and the proportional reduction in total variance (sometimes labelled marginal </w:t>
+        <w:t>We computed descriptive statistics for each standardised claim ratio (mean, standard deviation, median, interquartile range, minimum, maximum and coefficient of variation). To account for the nesting of secondary medical areas within prefectures, we fitted multilevel linear models with prefecture random intercepts and a binary fixed effect for university hospital presence, using restricted maximum likelihood. The null model intraclass correlation coefficient quantified the proportion of variance between prefectures, and the proportional reduction in total variance (sometimes labelled marginal R</w:t>
       </w:r>
-      <m:oMath>
-        <m:sSup>
-          <m:e>
-            <m:r>
-              <m:t xml:space="preserve">R</m:t>
-            </m:r>
-          </m:e>
-          <m:sup>
-            <m:r>
-              <m:t xml:space="preserve">2</m:t>
-            </m:r>
-          </m:sup>
-        </m:sSup>
-      </m:oMath>
+      <w:r>
+        <w:rPr>
+          <w:rFonts w:ascii="Times New Roman" w:hAnsi="Times New Roman"/>
+          <w:sz w:val="24"/>
+          <w:vertAlign w:val="superscript"/>
+        </w:rPr>
+        <w:t>2</w:t>
+      </w:r>
       <w:r>
         <w:rPr>
           <w:rFonts w:ascii="Times New Roman" w:hAnsi="Times New Roman"/>
@@ -1344,148 +1248,7 @@
           <w:rFonts w:ascii="Times New Roman" w:hAnsi="Times New Roman"/>
           <w:sz w:val="24"/>
         </w:rPr>
-        <w:t xml:space="preserve">The null multilevel model showed that only 0.058 of general anaesthesia variance was attributable to the prefecture level (intraclass correlation coefficient 0.058), indicating that 94.2% occurred within prefectures where audit policy is uniform. Spinal anaesthesia showed stronger prefecture-level clustering (intraclass correlation coefficient 0.343), consistent with a greater role of prefectural factors for that code. Adding university hospital presence as a fixed effect produced the largest proportional reduction in total variance for general anaesthesia (0.358; </w:t>
-      </w:r>
-      <m:oMath>
-        <m:r>
-          <m:t xml:space="preserve">β </m:t>
-        </m:r>
-        <m:r>
-          <m:t xml:space="preserve">= </m:t>
-        </m:r>
-        <m:r>
-          <m:t xml:space="preserve">64.1</m:t>
-        </m:r>
-        <m:r>
-          <m:t xml:space="preserve">, </m:t>
-        </m:r>
-        <m:r>
-          <m:t xml:space="preserve">95% confidence interval </m:t>
-        </m:r>
-        <m:r>
-          <m:t xml:space="preserve">54.8 </m:t>
-        </m:r>
-        <m:r>
-          <m:t xml:space="preserve">to </m:t>
-        </m:r>
-        <m:r>
-          <m:t xml:space="preserve">73.4</m:t>
-        </m:r>
-      </m:oMath>
-      <w:r>
-        <w:rPr>
-          <w:rFonts w:ascii="Times New Roman" w:hAnsi="Times New Roman"/>
-          <w:sz w:val="24"/>
-        </w:rPr>
-        <w:t xml:space="preserve">) and was statistically significant for every code (all </w:t>
-      </w:r>
-      <m:oMath>
-        <m:r>
-          <m:t xml:space="preserve">P </m:t>
-        </m:r>
-        <m:r>
-          <m:t xml:space="preserve">&lt;</m:t>
-        </m:r>
-        <m:r>
-          <m:t xml:space="preserve">0.001</m:t>
-        </m:r>
-      </m:oMath>
-      <w:r>
-        <w:rPr>
-          <w:rFonts w:ascii="Times New Roman" w:hAnsi="Times New Roman"/>
-          <w:sz w:val="24"/>
-        </w:rPr>
-        <w:t>) (Table 2). A log-transformed sensitivity model yielded the same direction of association for general anaesthesia (</w:t>
-      </w:r>
-      <m:oMath>
-        <m:r>
-          <m:t xml:space="preserve">β </m:t>
-        </m:r>
-        <m:r>
-          <m:t xml:space="preserve">= </m:t>
-        </m:r>
-        <m:r>
-          <m:t xml:space="preserve">0.75</m:t>
-        </m:r>
-        <m:r>
-          <m:t xml:space="preserve">, </m:t>
-        </m:r>
-        <m:r>
-          <m:t xml:space="preserve">95% CI </m:t>
-        </m:r>
-        <m:r>
-          <m:t xml:space="preserve">0.61 </m:t>
-        </m:r>
-        <m:r>
-          <m:t xml:space="preserve">to </m:t>
-        </m:r>
-        <m:r>
-          <m:t xml:space="preserve">0.89</m:t>
-        </m:r>
-        <m:r>
-          <m:t xml:space="preserve">, </m:t>
-        </m:r>
-        <m:r>
-          <m:t xml:space="preserve">P </m:t>
-        </m:r>
-        <m:r>
-          <m:t xml:space="preserve">&lt;</m:t>
-        </m:r>
-        <m:r>
-          <m:t xml:space="preserve">0.001</m:t>
-        </m:r>
-      </m:oMath>
-      <w:r>
-        <w:rPr>
-          <w:rFonts w:ascii="Times New Roman" w:hAnsi="Times New Roman"/>
-          <w:sz w:val="24"/>
-        </w:rPr>
-        <w:t xml:space="preserve">), supporting the robustness of the linear model findings to right-skewed ratios and extreme outliers. University hospital areas had higher general anaesthesia ratios than non-university areas in 47 of 47 prefectures, with a mean within-prefecture difference of +63.3 points (paired </w:t>
-      </w:r>
-      <m:oMath>
-        <m:r>
-          <m:t xml:space="preserve">t </m:t>
-        </m:r>
-        <m:r>
-          <m:t xml:space="preserve">= </m:t>
-        </m:r>
-        <m:r>
-          <m:t xml:space="preserve">13.28</m:t>
-        </m:r>
-        <m:r>
-          <m:t xml:space="preserve">, </m:t>
-        </m:r>
-        <m:r>
-          <m:t xml:space="preserve">P </m:t>
-        </m:r>
-        <m:r>
-          <m:t xml:space="preserve">&lt;</m:t>
-        </m:r>
-        <m:r>
-          <m:t xml:space="preserve">0.001</m:t>
-        </m:r>
-      </m:oMath>
-      <w:r>
-        <w:rPr>
-          <w:rFonts w:ascii="Times New Roman" w:hAnsi="Times New Roman"/>
-          <w:sz w:val="24"/>
-        </w:rPr>
-        <w:t>) (Figure 2A). Cohen's d for the university hospital effect on general anaesthesia was 1.88; on continuous epidural infusion 1.12; on epidural anaesthesia 0.59; and on spinal anaesthesia 0.40. As a robustness check we averaged the L008 and L003 standardised claim ratios (an unweighted mean, not a clinical co-administration rate; 331 areas with data for both codes); this combined measure showed a coefficient of variation of 55.5% and preserved a large university hospital effect (</w:t>
-      </w:r>
-      <m:oMath>
-        <m:r>
-          <m:t xml:space="preserve">Cohen's d </m:t>
-        </m:r>
-        <m:r>
-          <m:t xml:space="preserve">1.55</m:t>
-        </m:r>
-      </m:oMath>
-      <w:r>
-        <w:rPr>
-          <w:rFonts w:ascii="Times New Roman" w:hAnsi="Times New Roman"/>
-          <w:sz w:val="24"/>
-        </w:rPr>
-        <w:t>; university mean 130.3 versus non-university 70.2) (Figure 2B).</w:t>
+        <w:t>The null multilevel model showed that only 0.058 of general anaesthesia variance was attributable to the prefecture level (intraclass correlation coefficient 0.058), indicating that 94.2% occurred within prefectures where audit policy is uniform. Spinal anaesthesia showed stronger prefecture-level clustering (intraclass correlation coefficient 0.343), consistent with a greater role of prefectural factors for that code. Adding university hospital presence as a fixed effect produced the largest proportional reduction in total variance for general anaesthesia (0.358; β = 64.1, 95% confidence interval 54.8 to 73.4) and was statistically significant for every code (all P &lt;0.001) (Table 2). A log-transformed sensitivity model yielded the same direction of association for general anaesthesia (β = 0.75, 95% CI 0.61 to 0.89, P &lt;0.001), supporting the robustness of the linear model findings to right-skewed ratios and extreme outliers. University hospital areas had higher general anaesthesia ratios than non-university areas in 47 of 47 prefectures, with a mean within-prefecture difference of +63.3 points (paired t = 13.28, P &lt;0.001) (Figure 2A). Cohen's d for the university hospital effect on general anaesthesia was 1.88; on continuous epidural infusion 1.12; on epidural anaesthesia 0.59; and on spinal anaesthesia 0.40. As a robustness check we averaged the L008 and L003 standardised claim ratios (an unweighted mean, not a clinical co-administration rate; 331 areas with data for both codes); this combined measure showed a coefficient of variation of 55.5% and preserved a large university hospital effect (Cohen's d 1.55; university mean 130.3 versus non-university 70.2) (Figure 2B).</w:t>
       </w:r>
     </w:p>
     <w:p>
@@ -1559,19 +1322,7 @@
                 <w:b/>
                 <w:sz w:val="20"/>
               </w:rPr>
-            </w:r>
-            <m:oMath>
-              <m:r>
-                <m:t xml:space="preserve">β</m:t>
-              </m:r>
-            </m:oMath>
-            <w:r>
-              <w:rPr>
-                <w:rFonts w:ascii="Times New Roman" w:hAnsi="Times New Roman"/>
-                <w:b/>
-                <w:sz w:val="20"/>
-              </w:rPr>
-              <w:t xml:space="preserve"> university (95% CI)</w:t>
+              <w:t>β university (95% CI)</w:t>
             </w:r>
           </w:p>
         </w:tc>
@@ -1927,19 +1678,7 @@
           <w:i/>
           <w:sz w:val="24"/>
         </w:rPr>
-      </w:r>
-      <m:oMath>
-        <m:r>
-          <m:t xml:space="preserve">β</m:t>
-        </m:r>
-      </m:oMath>
-      <w:r>
-        <w:rPr>
-          <w:rFonts w:ascii="Times New Roman" w:hAnsi="Times New Roman"/>
-          <w:i/>
-          <w:sz w:val="24"/>
-        </w:rPr>
-        <w:t xml:space="preserve"> university, fixed effect coefficient for university hospital presence (binary 0/1); CI, confidence interval; ICC, intraclass correlation coefficient (proportion of variance attributable to prefecture level in the null random-intercept model); proportional reduction in total variance, decrease in total (prefecture + residual) variance after adding the university hospital fixed effect to the null random-intercept model. Models were estimated by restricted maximum likelihood.</w:t>
+        <w:t>β university, fixed effect coefficient for university hospital presence (binary 0/1); CI, confidence interval; ICC, intraclass correlation coefficient (proportion of variance attributable to prefecture level in the null random-intercept model); proportional reduction in total variance, decrease in total (prefecture + residual) variance after adding the university hospital fixed effect to the null random-intercept model. Models were estimated by restricted maximum likelihood.</w:t>
       </w:r>
     </w:p>
     <w:p>
@@ -1948,229 +1687,7 @@
           <w:rFonts w:ascii="Times New Roman" w:hAnsi="Times New Roman"/>
           <w:sz w:val="24"/>
         </w:rPr>
-        <w:t>A covariate-adjusted sensitivity model added the natural logarithm of population density and the anaesthesiologist share of all physicians (both standardised). The university hospital coefficient was attenuated but remained positive and statistically significant for general anaesthesia (</w:t>
-      </w:r>
-      <m:oMath>
-        <m:r>
-          <m:t xml:space="preserve">β </m:t>
-        </m:r>
-        <m:r>
-          <m:t xml:space="preserve">= </m:t>
-        </m:r>
-        <m:r>
-          <m:t xml:space="preserve">+41.8</m:t>
-        </m:r>
-        <m:r>
-          <m:t xml:space="preserve">, </m:t>
-        </m:r>
-        <m:r>
-          <m:t xml:space="preserve">95% CI </m:t>
-        </m:r>
-        <m:r>
-          <m:t xml:space="preserve">32.4 </m:t>
-        </m:r>
-        <m:r>
-          <m:t xml:space="preserve">to </m:t>
-        </m:r>
-        <m:r>
-          <m:t xml:space="preserve">51.2</m:t>
-        </m:r>
-        <m:r>
-          <m:t xml:space="preserve">, </m:t>
-        </m:r>
-        <m:r>
-          <m:t xml:space="preserve">P </m:t>
-        </m:r>
-        <m:r>
-          <m:t xml:space="preserve">&lt;</m:t>
-        </m:r>
-        <m:r>
-          <m:t xml:space="preserve">0.001</m:t>
-        </m:r>
-      </m:oMath>
-      <w:r>
-        <w:rPr>
-          <w:rFonts w:ascii="Times New Roman" w:hAnsi="Times New Roman"/>
-          <w:sz w:val="24"/>
-        </w:rPr>
-        <w:t>), epidural anaesthesia (</w:t>
-      </w:r>
-      <m:oMath>
-        <m:r>
-          <m:t xml:space="preserve">β </m:t>
-        </m:r>
-        <m:r>
-          <m:t xml:space="preserve">= </m:t>
-        </m:r>
-        <m:r>
-          <m:t xml:space="preserve">+39.1</m:t>
-        </m:r>
-        <m:r>
-          <m:t xml:space="preserve">, </m:t>
-        </m:r>
-        <m:r>
-          <m:t xml:space="preserve">95% CI </m:t>
-        </m:r>
-        <m:r>
-          <m:t xml:space="preserve">14.5 </m:t>
-        </m:r>
-        <m:r>
-          <m:t xml:space="preserve">to </m:t>
-        </m:r>
-        <m:r>
-          <m:t xml:space="preserve">63.7</m:t>
-        </m:r>
-        <m:r>
-          <m:t xml:space="preserve">, </m:t>
-        </m:r>
-        <m:r>
-          <m:t xml:space="preserve">P </m:t>
-        </m:r>
-        <m:r>
-          <m:t xml:space="preserve">0.002</m:t>
-        </m:r>
-      </m:oMath>
-      <w:r>
-        <w:rPr>
-          <w:rFonts w:ascii="Times New Roman" w:hAnsi="Times New Roman"/>
-          <w:sz w:val="24"/>
-        </w:rPr>
-        <w:t>) and continuous epidural infusion (</w:t>
-      </w:r>
-      <m:oMath>
-        <m:r>
-          <m:t xml:space="preserve">β </m:t>
-        </m:r>
-        <m:r>
-          <m:t xml:space="preserve">= </m:t>
-        </m:r>
-        <m:r>
-          <m:t xml:space="preserve">+33.9</m:t>
-        </m:r>
-        <m:r>
-          <m:t xml:space="preserve">, </m:t>
-        </m:r>
-        <m:r>
-          <m:t xml:space="preserve">95% CI </m:t>
-        </m:r>
-        <m:r>
-          <m:t xml:space="preserve">20.0 </m:t>
-        </m:r>
-        <m:r>
-          <m:t xml:space="preserve">to </m:t>
-        </m:r>
-        <m:r>
-          <m:t xml:space="preserve">47.7</m:t>
-        </m:r>
-        <m:r>
-          <m:t xml:space="preserve">, </m:t>
-        </m:r>
-        <m:r>
-          <m:t xml:space="preserve">P </m:t>
-        </m:r>
-        <m:r>
-          <m:t xml:space="preserve">&lt;</m:t>
-        </m:r>
-        <m:r>
-          <m:t xml:space="preserve">0.001</m:t>
-        </m:r>
-      </m:oMath>
-      <w:r>
-        <w:rPr>
-          <w:rFonts w:ascii="Times New Roman" w:hAnsi="Times New Roman"/>
-          <w:sz w:val="24"/>
-        </w:rPr>
-        <w:t>). For spinal anaesthesia the point estimate was positive but no longer statistically significant (</w:t>
-      </w:r>
-      <m:oMath>
-        <m:r>
-          <m:t xml:space="preserve">β </m:t>
-        </m:r>
-        <m:r>
-          <m:t xml:space="preserve">= </m:t>
-        </m:r>
-        <m:r>
-          <m:t xml:space="preserve">+9.7</m:t>
-        </m:r>
-        <m:r>
-          <m:t xml:space="preserve">, </m:t>
-        </m:r>
-        <m:r>
-          <m:t xml:space="preserve">95% CI </m:t>
-        </m:r>
-        <m:r>
-          <m:t xml:space="preserve">-4.0 </m:t>
-        </m:r>
-        <m:r>
-          <m:t xml:space="preserve">to </m:t>
-        </m:r>
-        <m:r>
-          <m:t xml:space="preserve">23.3</m:t>
-        </m:r>
-        <m:r>
-          <m:t xml:space="preserve">, </m:t>
-        </m:r>
-        <m:r>
-          <m:t xml:space="preserve">P </m:t>
-        </m:r>
-        <m:r>
-          <m:t xml:space="preserve">0.165</m:t>
-        </m:r>
-      </m:oMath>
-      <w:r>
-        <w:rPr>
-          <w:rFonts w:ascii="Times New Roman" w:hAnsi="Times New Roman"/>
-          <w:sz w:val="24"/>
-        </w:rPr>
-        <w:t>). Population density was positively associated with general anaesthesia ratios (</w:t>
-      </w:r>
-      <m:oMath>
-        <m:r>
-          <m:t xml:space="preserve">β </m:t>
-        </m:r>
-        <m:r>
-          <m:t xml:space="preserve">= </m:t>
-        </m:r>
-        <m:r>
-          <m:t xml:space="preserve">8.3</m:t>
-        </m:r>
-        <m:r>
-          <m:t xml:space="preserve">, </m:t>
-        </m:r>
-        <m:r>
-          <m:t xml:space="preserve">P </m:t>
-        </m:r>
-        <m:r>
-          <m:t xml:space="preserve">&lt;</m:t>
-        </m:r>
-        <m:r>
-          <m:t xml:space="preserve">0.001</m:t>
-        </m:r>
-      </m:oMath>
-      <w:r>
-        <w:rPr>
-          <w:rFonts w:ascii="Times New Roman" w:hAnsi="Times New Roman"/>
-          <w:sz w:val="24"/>
-        </w:rPr>
-        <w:t>) but not with the other three codes. The anaesthesiologist share was positively associated with general, epidural, continuous epidural and spinal anaesthesia (</w:t>
-      </w:r>
-      <m:oMath>
-        <m:r>
-          <m:t xml:space="preserve">P </m:t>
-        </m:r>
-        <m:r>
-          <m:t xml:space="preserve">&lt;</m:t>
-        </m:r>
-        <m:r>
-          <m:t xml:space="preserve">0.001</m:t>
-        </m:r>
-      </m:oMath>
-      <w:r>
-        <w:rPr>
-          <w:rFonts w:ascii="Times New Roman" w:hAnsi="Times New Roman"/>
-          <w:sz w:val="24"/>
-        </w:rPr>
-        <w:t>, 0.039, &lt;0.001 and 0.005, respectively). The covariate-adjusted mixed models produced optimizer-convergence warnings in Statsmodels</w:t>
+        <w:t>A covariate-adjusted sensitivity model added the natural logarithm of population density and the anaesthesiologist share of all physicians (both standardised). The university hospital coefficient was attenuated but remained positive and statistically significant for general anaesthesia (β = +41.8, 95% CI 32.4 to 51.2, P &lt;0.001), epidural anaesthesia (β = +39.1, 95% CI 14.5 to 63.7, P 0.002) and continuous epidural infusion (β = +33.9, 95% CI 20.0 to 47.7, P &lt;0.001). For spinal anaesthesia the point estimate was positive but no longer statistically significant (β = +9.7, 95% CI -4.0 to 23.3, P 0.165). Population density was positively associated with general anaesthesia ratios (β = 8.3, P &lt;0.001) but not with the other three codes. The anaesthesiologist share was positively associated with general, epidural, continuous epidural and spinal anaesthesia (P &lt;0.001, 0.039, &lt;0.001 and 0.005, respectively). The covariate-adjusted mixed models produced optimizer-convergence warnings in Statsmodels</w:t>
       </w:r>
       <w:r>
         <w:rPr>
@@ -2263,82 +1780,7 @@
           <w:rFonts w:ascii="Times New Roman" w:hAnsi="Times New Roman"/>
           <w:sz w:val="24"/>
         </w:rPr>
-        <w:t>All pre-specified sensitivity analyses pointed away from differential auditing as the main explanation. First, within-prefecture variance decomposition attributed 14.5% of general anaesthesia variance to between-prefecture differences, 40.5% to the university hospital effect within prefecture, and 45.0% to residual within-group variation; the university hospital effect alone explained 47.4% of all within-prefecture variance. Second, general and spinal anaesthesia were positively correlated (</w:t>
-      </w:r>
-      <m:oMath>
-        <m:r>
-          <m:t xml:space="preserve">r </m:t>
-        </m:r>
-        <m:r>
-          <m:t xml:space="preserve">= </m:t>
-        </m:r>
-        <m:r>
-          <m:t xml:space="preserve">0.235</m:t>
-        </m:r>
-        <m:r>
-          <m:t xml:space="preserve">, </m:t>
-        </m:r>
-        <m:r>
-          <m:t xml:space="preserve">P </m:t>
-        </m:r>
-        <m:r>
-          <m:t xml:space="preserve">&lt;</m:t>
-        </m:r>
-        <m:r>
-          <m:t xml:space="preserve">0.001</m:t>
-        </m:r>
-      </m:oMath>
-      <w:r>
-        <w:rPr>
-          <w:rFonts w:ascii="Times New Roman" w:hAnsi="Times New Roman"/>
-          <w:sz w:val="24"/>
-        </w:rPr>
-        <w:t>), as were general and epidural anaesthesia (</w:t>
-      </w:r>
-      <m:oMath>
-        <m:r>
-          <m:t xml:space="preserve">r </m:t>
-        </m:r>
-        <m:r>
-          <m:t xml:space="preserve">= </m:t>
-        </m:r>
-        <m:r>
-          <m:t xml:space="preserve">0.319</m:t>
-        </m:r>
-        <m:r>
-          <m:t xml:space="preserve">, </m:t>
-        </m:r>
-        <m:r>
-          <m:t xml:space="preserve">P </m:t>
-        </m:r>
-        <m:r>
-          <m:t xml:space="preserve">&lt;</m:t>
-        </m:r>
-        <m:r>
-          <m:t xml:space="preserve">0.001</m:t>
-        </m:r>
-      </m:oMath>
-      <w:r>
-        <w:rPr>
-          <w:rFonts w:ascii="Times New Roman" w:hAnsi="Times New Roman"/>
-          <w:sz w:val="24"/>
-        </w:rPr>
-        <w:t>). Positive correlations are more consistent with a common supply-side factor than with audit-driven reclassification, although a uniform audit effect across all codes cannot be ruled out. Third, the maximum prefectural audit-rate difference of 0.28 percentage points could produce a ratio shift of approximately 0.28 points under the conservative, linear one-to-one mapping, equivalent to approximately 0.53% of the observed interquartile range for general anaesthesia and 0.27% for epidural anaesthesia. Fourth, combining general (L008) and spinal (L004) ratios produced an alternative measure that should be insensitive to miscoding between reclassifiable codes; it showed a coefficient of variation of 43.4% and a university hospital effect that remained large (</w:t>
-      </w:r>
-      <m:oMath>
-        <m:r>
-          <m:t xml:space="preserve">Cohen's d </m:t>
-        </m:r>
-        <m:r>
-          <m:t xml:space="preserve">1.26</m:t>
-        </m:r>
-      </m:oMath>
-      <w:r>
-        <w:rPr>
-          <w:rFonts w:ascii="Times New Roman" w:hAnsi="Times New Roman"/>
-          <w:sz w:val="24"/>
-        </w:rPr>
-        <w:t>), confirming that the structural effect is not artefactually erased by combining codes.</w:t>
+        <w:t>All pre-specified sensitivity analyses pointed away from differential auditing as the main explanation. First, within-prefecture variance decomposition attributed 14.5% of general anaesthesia variance to between-prefecture differences, 40.5% to the university hospital effect within prefecture, and 45.0% to residual within-group variation; the university hospital effect alone explained 47.4% of all within-prefecture variance. Second, general and spinal anaesthesia were positively correlated (r = 0.235, P &lt;0.001), as were general and epidural anaesthesia (r = 0.319, P &lt;0.001). Positive correlations are more consistent with a common supply-side factor than with audit-driven reclassification, although a uniform audit effect across all codes cannot be ruled out. Third, the maximum prefectural audit-rate difference of 0.28 percentage points could produce a ratio shift of approximately 0.28 points under the conservative, linear one-to-one mapping, equivalent to approximately 0.53% of the observed interquartile range for general anaesthesia and 0.27% for epidural anaesthesia. Fourth, combining general (L008) and spinal (L004) ratios produced an alternative measure that should be insensitive to miscoding between reclassifiable codes; it showed a coefficient of variation of 43.4% and a university hospital effect that remained large (Cohen's d 1.26), confirming that the structural effect is not artefactually erased by combining codes.</w:t>
       </w:r>
     </w:p>
     <w:p>
@@ -2509,25 +1951,7 @@
           <w:rFonts w:ascii="Times New Roman" w:hAnsi="Times New Roman"/>
           <w:sz w:val="24"/>
         </w:rPr>
-        <w:t>. Our study extends this evidence by exploiting Japan's uniform fee schedule combined with prefecture-specific auditing to disentangle administrative and structural sources of variation, and, to our knowledge, is one of the first multilevel small-area analyses of anaesthesia technique under universal coverage in East Asia using publicly available, nationwide standardised claim ratios. The university hospital effect we report (</w:t>
-      </w:r>
-      <m:oMath>
-        <m:r>
-          <m:t xml:space="preserve">Cohen's d </m:t>
-        </m:r>
-        <m:r>
-          <m:t xml:space="preserve">= </m:t>
-        </m:r>
-        <m:r>
-          <m:t xml:space="preserve">1.88</m:t>
-        </m:r>
-      </m:oMath>
-      <w:r>
-        <w:rPr>
-          <w:rFonts w:ascii="Times New Roman" w:hAnsi="Times New Roman"/>
-          <w:sz w:val="24"/>
-        </w:rPr>
-        <w:t>) is substantial, plausibly reflecting the influence of the ikyoku (university medical office) system on practice in affiliated hospitals</w:t>
+        <w:t>. Our study extends this evidence by exploiting Japan's uniform fee schedule combined with prefecture-specific auditing to disentangle administrative and structural sources of variation, and, to our knowledge, is one of the first multilevel small-area analyses of anaesthesia technique under universal coverage in East Asia using publicly available, nationwide standardised claim ratios. The university hospital effect we report (Cohen's d = 1.88) is substantial, plausibly reflecting the influence of the ikyoku (university medical office) system on practice in affiliated hospitals</w:t>
       </w:r>
       <w:r>
         <w:rPr>

</xml_diff>

<commit_message>
Align Health Policy variance-decomposition narrative with mixed model and keep R² as Unicode
Co-Authored-By: Tatsuki Onishi <bougtoir@gmail.com>
</commit_message>
<xml_diff>
--- a/documents/Health_Policy/regional_anaesthesia_Health_Policy_EN.docx
+++ b/documents/Health_Policy/regional_anaesthesia_Health_Policy_EN.docx
@@ -69,7 +69,7 @@
           <w:i/>
           <w:sz w:val="24"/>
         </w:rPr>
-        <w:t>Word count (main text, excluding abstract, references, tables and figures): approximately 3266 words</w:t>
+        <w:t>Word count (main text, excluding abstract, references, tables and figures): approximately 3262 words</w:t>
       </w:r>
     </w:p>
     <w:p>
@@ -535,22 +535,7 @@
           <w:rFonts w:ascii="Times New Roman" w:hAnsi="Times New Roman"/>
           <w:sz w:val="24"/>
         </w:rPr>
-        <w:t>We computed descriptive statistics for each standardised claim ratio (mean, standard deviation, median, interquartile range, minimum, maximum and coefficient of variation). To account for the nesting of secondary medical areas within prefectures, we fitted multilevel linear models with prefecture random intercepts and a binary fixed effect for university hospital presence, using restricted maximum likelihood. The null model intraclass correlation coefficient quantified the proportion of variance between prefectures, and the proportional reduction in total variance (sometimes labelled marginal R</w:t>
-      </w:r>
-      <w:r>
-        <w:rPr>
-          <w:rFonts w:ascii="Times New Roman" w:hAnsi="Times New Roman"/>
-          <w:sz w:val="24"/>
-          <w:vertAlign w:val="superscript"/>
-        </w:rPr>
-        <w:t>2</w:t>
-      </w:r>
-      <w:r>
-        <w:rPr>
-          <w:rFonts w:ascii="Times New Roman" w:hAnsi="Times New Roman"/>
-          <w:sz w:val="24"/>
-        </w:rPr>
-        <w:t>) measured the decrease in total (prefecture-level plus residual) variance after adding the university-hospital fixed effect. We decomposed within-prefecture variance into components attributable to university-hospital presence and residual variation. We conducted four sensitivity analyses to test the audit hypothesis: within-prefecture paired comparisons of university and non-university areas; a covariate-adjusted model adding the natural logarithm of population density and the anaesthesiologist share of all physicians; an empirical Bayes shrinkage stress-test of area-level ratios toward prefecture means; and a log-transformed multilevel model to address right-skewed SCR distributions and influential outliers. No formal multiple-comparison adjustment was applied; reported p-values are nominal and should be interpreted as exploratory. All analyses were performed in Python 3.10 using NumPy, Pandas, SciPy and Statsmodels.</w:t>
+        <w:t>We computed descriptive statistics for each standardised claim ratio (mean, standard deviation, median, interquartile range, minimum, maximum and coefficient of variation). To account for the nesting of secondary medical areas within prefectures, we fitted multilevel linear models with prefecture random intercepts and a binary fixed effect for university hospital presence, using restricted maximum likelihood. The null model intraclass correlation coefficient quantified the proportion of variance between prefectures, and the proportional reduction in total variance (sometimes labelled marginal R²) measured the decrease in total (prefecture-level plus residual) variance after adding the university-hospital fixed effect. We conducted four sensitivity analyses to test the audit hypothesis: within-prefecture paired comparisons of university and non-university areas; a covariate-adjusted model adding the natural logarithm of population density and the anaesthesiologist share of all physicians; an empirical Bayes shrinkage stress-test of area-level ratios toward prefecture means; and a log-transformed multilevel model to address right-skewed SCR distributions and influential outliers. No formal multiple-comparison adjustment was applied; reported p-values are nominal and should be interpreted as exploratory. All analyses were performed in Python 3.10 using NumPy, Pandas, SciPy and Statsmodels.</w:t>
       </w:r>
     </w:p>
     <w:p>
@@ -1780,7 +1765,7 @@
           <w:rFonts w:ascii="Times New Roman" w:hAnsi="Times New Roman"/>
           <w:sz w:val="24"/>
         </w:rPr>
-        <w:t>All pre-specified sensitivity analyses pointed away from differential auditing as the main explanation. First, within-prefecture variance decomposition attributed 14.5% of general anaesthesia variance to between-prefecture differences, 40.5% to the university hospital effect within prefecture, and 45.0% to residual within-group variation; the university hospital effect alone explained 47.4% of all within-prefecture variance. Second, general and spinal anaesthesia were positively correlated (r = 0.235, P &lt;0.001), as were general and epidural anaesthesia (r = 0.319, P &lt;0.001). Positive correlations are more consistent with a common supply-side factor than with audit-driven reclassification, although a uniform audit effect across all codes cannot be ruled out. Third, the maximum prefectural audit-rate difference of 0.28 percentage points could produce a ratio shift of approximately 0.28 points under the conservative, linear one-to-one mapping, equivalent to approximately 0.53% of the observed interquartile range for general anaesthesia and 0.27% for epidural anaesthesia. Fourth, combining general (L008) and spinal (L004) ratios produced an alternative measure that should be insensitive to miscoding between reclassifiable codes; it showed a coefficient of variation of 43.4% and a university hospital effect that remained large (Cohen's d 1.26), confirming that the structural effect is not artefactually erased by combining codes.</w:t>
+        <w:t>All pre-specified sensitivity analyses pointed away from differential auditing as the main explanation. First, the multilevel model estimates that only 0.058 of general anaesthesia variance lies between prefectures, where audit policy differs, so differential auditing can account for at most a small share of observed variation. University hospital presence explained 0.358 of total variance in the same model, a structural component far larger than the between-prefecture share. Second, general and spinal anaesthesia were positively correlated (r = 0.235, P &lt;0.001), as were general and epidural anaesthesia (r = 0.319, P &lt;0.001). Positive correlations are more consistent with a common supply-side factor than with audit-driven reclassification, although a uniform audit effect across all codes cannot be ruled out. Third, the maximum prefectural audit-rate difference of 0.28 percentage points could produce a ratio shift of approximately 0.28 points under the conservative, linear one-to-one mapping, equivalent to approximately 0.53% of the observed interquartile range for general anaesthesia and 0.27% for epidural anaesthesia. Fourth, combining general (L008) and spinal (L004) ratios produced an alternative measure that should be insensitive to miscoding between reclassifiable codes; it showed a coefficient of variation of 43.4% and a university hospital effect that remained large (Cohen's d 1.26), confirming that the structural effect is not artefactually erased by combining codes.</w:t>
       </w:r>
     </w:p>
     <w:p>

</xml_diff>

<commit_message>
Health Policy journal-fit improvements: TIFF figures, softened causal language, code mapping footnote, Research in context box, Zenodo metadata
Co-Authored-By: Tatsuki Onishi <bougtoir@gmail.com>
</commit_message>
<xml_diff>
--- a/documents/Health_Policy/regional_anaesthesia_Health_Policy_EN.docx
+++ b/documents/Health_Policy/regional_anaesthesia_Health_Policy_EN.docx
@@ -69,7 +69,7 @@
           <w:i/>
           <w:sz w:val="24"/>
         </w:rPr>
-        <w:t>Word count (main text, excluding abstract, references, tables and figures): approximately 3262 words</w:t>
+        <w:t>Word count (main text, excluding abstract, references, tables and figures): approximately 3381 words</w:t>
       </w:r>
     </w:p>
     <w:p>
@@ -190,7 +190,7 @@
           <w:rFonts w:ascii="Times New Roman" w:hAnsi="Times New Roman"/>
           <w:sz w:val="24"/>
         </w:rPr>
-        <w:t>Conclusion: Regional variation in anaesthesia practice is predominantly structural, driven by access to university hospitals rather than by prefectural auditing. In universal-coverage systems this pattern indicates inequitable access to neuraxial techniques; policy should address workforce and organisational barriers, not additional coding audits.</w:t>
+        <w:t>Conclusion: Regional variation in anaesthesia practice is predominantly structural, driven by access to university hospitals rather than by prefectural auditing. In universal-coverage systems this pattern indicates inequitable access to neuraxial techniques; policy efforts may need to address workforce and organisational barriers, not additional coding audits.</w:t>
       </w:r>
     </w:p>
     <w:p>
@@ -2010,7 +2010,7 @@
           <w:rFonts w:ascii="Times New Roman" w:hAnsi="Times New Roman"/>
           <w:sz w:val="24"/>
         </w:rPr>
-        <w:t>. Geographic variation in these techniques therefore translates into variation in potentially modifiable patient outcomes, not merely variation in billing. Because the observed gradient is not explained by differential auditing, interventions should target workforce distribution, training and organisational capacity rather than coding compliance.</w:t>
+        <w:t>. Geographic variation in these techniques therefore translates into variation in potentially modifiable patient outcomes, not merely variation in billing. Because the observed gradient is not explained by differential auditing, interventions may warrant targeting workforce distribution, training and organisational capacity rather than coding compliance.</w:t>
       </w:r>
     </w:p>
     <w:p>
@@ -2032,7 +2032,7 @@
           <w:rFonts w:ascii="Times New Roman" w:hAnsi="Times New Roman"/>
           <w:sz w:val="24"/>
         </w:rPr>
-        <w:t>Three policy implications follow. First, administrative claims data can be used as a surveillance tool to monitor small-area variation in perioperative care under universal coverage, but should be interpreted alongside sensitivity analyses for coding and audit effects. Second, the observed variation in epidural and continuous epidural use signals a potential equity gap: patients' access to techniques that may improve recovery should not depend on whether they live near a university hospital. Third, regulators should focus on workforce and organisational determinants of anaesthesia service delivery rather than treating low regional ratios primarily as coding or fraud problems. The variance-decomposition framework is transferable to other procedures and to systems with a national fee schedule and regional audit variation, but the audit-specific interpretation is limited in settings where fee and insurance structures are heterogeneous.</w:t>
+        <w:t>Three potential policy implications follow. First, administrative claims data can be used as a surveillance tool to monitor small-area variation in perioperative care under universal coverage, but should be interpreted alongside sensitivity analyses for coding and audit effects. Second, the observed variation in epidural and continuous epidural use suggests a potential equity gap: patients' access to techniques that may improve recovery appears to depend on whether they live near a university hospital. Third, regulators may wish to focus on workforce and organisational determinants of anaesthesia service delivery rather than treating low regional ratios primarily as coding or fraud problems. The variance-decomposition framework is transferable to other procedures and to systems with a national fee schedule and regional audit variation, but the audit-specific interpretation is limited in settings where fee and insurance structures are heterogeneous.</w:t>
       </w:r>
     </w:p>
     <w:p>
@@ -2054,7 +2054,56 @@
           <w:rFonts w:ascii="Times New Roman" w:hAnsi="Times New Roman"/>
           <w:sz w:val="24"/>
         </w:rPr>
-        <w:t>Regional variation in anaesthesia practice under universal coverage in Japan is substantial and appears to reflect structural access factors -- notably proximity to university hospitals -- more than prefectural claims auditing. The pattern is best interpreted as a documented-service-delivery gradient with potentially inequitable access to neuraxial techniques. In countries without universal coverage or with heterogeneous reimbursement, the audit hypothesis cannot be isolated, although the structural-access framework can be adapted if comparable data exist. Perioperative surveillance of small-area variation should separate administrative from structural sources before interpreting claims data as care variation or as coding quality.</w:t>
+        <w:t>Regional variation in anaesthesia practice under universal coverage in Japan is substantial and appears to reflect structural access factors -- notably proximity to university hospitals -- more than prefectural claims auditing. The pattern is best interpreted as a documented-service-delivery gradient with potentially inequitable access to neuraxial techniques. In countries without universal coverage or with heterogeneous reimbursement, the audit hypothesis cannot be isolated, although the structural-access framework can be adapted if comparable data exist. Perioperative surveillance of small-area variation would benefit from separating administrative from structural sources before interpreting claims data as care variation or as coding quality.</w:t>
+      </w:r>
+    </w:p>
+    <w:p>
+      <w:pPr>
+        <w:spacing w:before="240" w:after="120"/>
+      </w:pPr>
+      <w:r>
+        <w:rPr>
+          <w:rFonts w:ascii="Times New Roman" w:hAnsi="Times New Roman"/>
+          <w:b/>
+          <w:sz w:val="26"/>
+        </w:rPr>
+        <w:t>6. RESEARCH IN CONTEXT</w:t>
+      </w:r>
+    </w:p>
+    <w:p>
+      <w:pPr>
+        <w:pStyle w:val="ListBullet"/>
+      </w:pPr>
+      <w:r>
+        <w:rPr>
+          <w:rFonts w:ascii="Times New Roman" w:hAnsi="Times New Roman"/>
+          <w:sz w:val="24"/>
+        </w:rPr>
+        <w:t>What is already known: Geographic variation in anaesthesia technique is well documented, but few studies have separated structural access to care from administrative coding and auditing effects in universal-coverage systems.</w:t>
+      </w:r>
+    </w:p>
+    <w:p>
+      <w:pPr>
+        <w:pStyle w:val="ListBullet"/>
+      </w:pPr>
+      <w:r>
+        <w:rPr>
+          <w:rFonts w:ascii="Times New Roman" w:hAnsi="Times New Roman"/>
+          <w:sz w:val="24"/>
+        </w:rPr>
+        <w:t>What this study adds: Across Japan's 335 secondary medical areas, university-hospital proximity was associated with large differences in standardised claim ratios, whereas prefectural claims-audit differences explained only a small share of variance.</w:t>
+      </w:r>
+    </w:p>
+    <w:p>
+      <w:pPr>
+        <w:pStyle w:val="ListBullet"/>
+      </w:pPr>
+      <w:r>
+        <w:rPr>
+          <w:rFonts w:ascii="Times New Roman" w:hAnsi="Times New Roman"/>
+          <w:sz w:val="24"/>
+        </w:rPr>
+        <w:t>What are the implications of these findings: Administrative claims can be used as a surveillance signal for perioperative variation in universal coverage settings, but low regional ratios should prompt review of workforce and organisational access before being treated as coding or fraud problems.</w:t>
       </w:r>
     </w:p>
     <w:p>

</xml_diff>

<commit_message>
Reviewer-driven polish: Word OMML equations, citation order, English naturalness, STROBE/cover letter refresh
- Convert all inline equations to Word OMML (<m:oMath>)

- Verify figure/table citations and first-appearance numbering

- Remove any residual old-version phrasing

- Naturalize English in intro/discussion/conclusions

- Rebuild full Health Policy submission package with 300 dpi TIFFs

Co-Authored-By: Tatsuki Onishi <bougtoir@gmail.com>
</commit_message>
<xml_diff>
--- a/documents/Health_Policy/regional_anaesthesia_Health_Policy_EN.docx
+++ b/documents/Health_Policy/regional_anaesthesia_Health_Policy_EN.docx
@@ -69,7 +69,7 @@
           <w:i/>
           <w:sz w:val="24"/>
         </w:rPr>
-        <w:t>Word count (main text, excluding abstract, references, tables and figures): approximately 3381 words</w:t>
+        <w:t>Word count (main text, excluding abstract, references, tables and figures): approximately 3359 words</w:t>
       </w:r>
     </w:p>
     <w:p>
@@ -305,7 +305,7 @@
           <w:rFonts w:ascii="Times New Roman" w:hAnsi="Times New Roman"/>
           <w:sz w:val="24"/>
         </w:rPr>
-        <w:t>. If access to these techniques varies by geography, patients' probability of receiving potentially beneficial care depends on place of residence, an equity problem under universal coverage. The FY2022 data predate the 2026 clarification of the general-anaesthesia billing code, so any residual coding ambiguity present at that time is retained in the analysis</w:t>
+        <w:t>. If access to these techniques varies by geography, patients' probability of receiving potentially beneficial care depends on place of residence, an equity problem under universal coverage. Because the FY2022 data predate the 2026 clarification of the general-anaesthesia billing code, any coding ambiguity that existed during the study period is retained in the analysis</w:t>
       </w:r>
       <w:r>
         <w:rPr>
@@ -463,7 +463,28 @@
           <w:rFonts w:ascii="Times New Roman" w:hAnsi="Times New Roman"/>
           <w:sz w:val="24"/>
         </w:rPr>
-        <w:t>. Standardised claim ratios are computed by indirect standardisation: expected claim frequencies are calculated by applying national age- and sex-specific claim rates to the local population structure, and the ratio is defined as 100 × (observed claims / expected claims). Ratios are calculated on a residence basis, so claims are attributed to the beneficiary's registered address rather than to the providing facility. Patient travel for treatment therefore does not inflate the ratio of the receiving area. Areas with very few claims are masked by the data provider to protect privacy and appear as missing values. Second, we obtained physician statistics from the 2022 Survey of Physicians, Dentists and Pharmacists</w:t>
+        <w:t xml:space="preserve">. Standardised claim ratios are computed by indirect standardisation: expected claim frequencies are calculated by applying national age- and sex-specific claim rates to the local population structure, and the ratio is defined as </w:t>
+      </w:r>
+      <w:r>
+        <w:rPr>
+          <w:rFonts w:ascii="Cambria Math" w:hAnsi="Cambria Math"/>
+          <w:sz w:val="24"/>
+        </w:rPr>
+        <m:oMath>
+          <m:r>
+            <m:rPr>
+              <m:sty m:val="p"/>
+            </m:rPr>
+            <m:t xml:space="preserve">100 × (O / E)</m:t>
+          </m:r>
+        </m:oMath>
+      </w:r>
+      <w:r>
+        <w:rPr>
+          <w:rFonts w:ascii="Times New Roman" w:hAnsi="Times New Roman"/>
+          <w:sz w:val="24"/>
+        </w:rPr>
+        <w:t>, where O and E are the observed and expected claim counts. Ratios are calculated on a residence basis, so claims are attributed to the beneficiary's registered address rather than to the providing facility. Patient travel for treatment therefore does not inflate the ratio of the receiving area. Areas with very few claims are masked by the data provider to protect privacy and appear as missing values. Second, we obtained physician statistics from the 2022 Survey of Physicians, Dentists and Pharmacists</w:t>
       </w:r>
       <w:r>
         <w:rPr>
@@ -1233,7 +1254,70 @@
           <w:rFonts w:ascii="Times New Roman" w:hAnsi="Times New Roman"/>
           <w:sz w:val="24"/>
         </w:rPr>
-        <w:t>The null multilevel model showed that only 0.058 of general anaesthesia variance was attributable to the prefecture level (intraclass correlation coefficient 0.058), indicating that 94.2% occurred within prefectures where audit policy is uniform. Spinal anaesthesia showed stronger prefecture-level clustering (intraclass correlation coefficient 0.343), consistent with a greater role of prefectural factors for that code. Adding university hospital presence as a fixed effect produced the largest proportional reduction in total variance for general anaesthesia (0.358; β = 64.1, 95% confidence interval 54.8 to 73.4) and was statistically significant for every code (all P &lt;0.001) (Table 2). A log-transformed sensitivity model yielded the same direction of association for general anaesthesia (β = 0.75, 95% CI 0.61 to 0.89, P &lt;0.001), supporting the robustness of the linear model findings to right-skewed ratios and extreme outliers. University hospital areas had higher general anaesthesia ratios than non-university areas in 47 of 47 prefectures, with a mean within-prefecture difference of +63.3 points (paired t = 13.28, P &lt;0.001) (Figure 2A). Cohen's d for the university hospital effect on general anaesthesia was 1.88; on continuous epidural infusion 1.12; on epidural anaesthesia 0.59; and on spinal anaesthesia 0.40. As a robustness check we averaged the L008 and L003 standardised claim ratios (an unweighted mean, not a clinical co-administration rate; 331 areas with data for both codes); this combined measure showed a coefficient of variation of 55.5% and preserved a large university hospital effect (Cohen's d 1.55; university mean 130.3 versus non-university 70.2) (Figure 2B).</w:t>
+        <w:t xml:space="preserve">The null multilevel model showed that only 0.058 of general anaesthesia variance was attributable to the prefecture level (intraclass correlation coefficient 0.058), indicating that 94.2% occurred within prefectures where audit policy is uniform. Spinal anaesthesia showed stronger prefecture-level clustering (intraclass correlation coefficient 0.343), consistent with a greater role of prefectural factors for that code. Adding university hospital presence as a fixed effect produced the largest proportional reduction in total variance for general anaesthesia (0.358; </w:t>
+      </w:r>
+      <w:r>
+        <w:rPr>
+          <w:rFonts w:ascii="Cambria Math" w:hAnsi="Cambria Math"/>
+          <w:sz w:val="24"/>
+        </w:rPr>
+        <m:oMath>
+          <m:r>
+            <m:rPr>
+              <m:sty m:val="p"/>
+            </m:rPr>
+            <m:t xml:space="preserve">β = 64.1</m:t>
+          </m:r>
+        </m:oMath>
+      </w:r>
+      <w:r>
+        <w:rPr>
+          <w:rFonts w:ascii="Times New Roman" w:hAnsi="Times New Roman"/>
+          <w:sz w:val="24"/>
+        </w:rPr>
+        <w:t>, 95% confidence interval 54.8 to 73.4) and was statistically significant for every code (all P &lt;0.001) (Table 2). A log-transformed sensitivity model yielded the same direction of association for general anaesthesia (</w:t>
+      </w:r>
+      <w:r>
+        <w:rPr>
+          <w:rFonts w:ascii="Cambria Math" w:hAnsi="Cambria Math"/>
+          <w:sz w:val="24"/>
+        </w:rPr>
+        <m:oMath>
+          <m:r>
+            <m:rPr>
+              <m:sty m:val="p"/>
+            </m:rPr>
+            <m:t xml:space="preserve">β = 0.75</m:t>
+          </m:r>
+        </m:oMath>
+      </w:r>
+      <w:r>
+        <w:rPr>
+          <w:rFonts w:ascii="Times New Roman" w:hAnsi="Times New Roman"/>
+          <w:sz w:val="24"/>
+        </w:rPr>
+        <w:t>, 95% CI 0.61 to 0.89, P &lt;0.001), supporting the robustness of the linear model findings to right-skewed ratios and extreme outliers. University hospital areas had higher general anaesthesia ratios than non-university areas in 47 of 47 prefectures, with a mean within-prefecture difference of +63.3 points (</w:t>
+      </w:r>
+      <w:r>
+        <w:rPr>
+          <w:rFonts w:ascii="Cambria Math" w:hAnsi="Cambria Math"/>
+          <w:sz w:val="24"/>
+        </w:rPr>
+        <m:oMath>
+          <m:r>
+            <m:rPr>
+              <m:sty m:val="p"/>
+            </m:rPr>
+            <m:t xml:space="preserve">t = 13.28</m:t>
+          </m:r>
+        </m:oMath>
+      </w:r>
+      <w:r>
+        <w:rPr>
+          <w:rFonts w:ascii="Times New Roman" w:hAnsi="Times New Roman"/>
+          <w:sz w:val="24"/>
+        </w:rPr>
+        <w:t>, P &lt;0.001) (Figure 2A). Cohen's d for the university hospital effect on general anaesthesia was 1.88; on continuous epidural infusion 1.12; on epidural anaesthesia 0.59; and on spinal anaesthesia 0.40. As a robustness check we averaged the L008 and L003 standardised claim ratios (an unweighted mean, not a clinical co-administration rate; 331 areas with data for both codes); this combined measure showed a coefficient of variation of 55.5% and preserved a large university hospital effect (Cohen's d 1.55; university mean 130.3 versus non-university 70.2) (Figure 2B).</w:t>
       </w:r>
     </w:p>
     <w:p>
@@ -1667,29 +1751,6 @@
       </w:r>
     </w:p>
     <w:p>
-      <w:r>
-        <w:rPr>
-          <w:rFonts w:ascii="Times New Roman" w:hAnsi="Times New Roman"/>
-          <w:sz w:val="24"/>
-        </w:rPr>
-        <w:t>A covariate-adjusted sensitivity model added the natural logarithm of population density and the anaesthesiologist share of all physicians (both standardised). The university hospital coefficient was attenuated but remained positive and statistically significant for general anaesthesia (β = +41.8, 95% CI 32.4 to 51.2, P &lt;0.001), epidural anaesthesia (β = +39.1, 95% CI 14.5 to 63.7, P 0.002) and continuous epidural infusion (β = +33.9, 95% CI 20.0 to 47.7, P &lt;0.001). For spinal anaesthesia the point estimate was positive but no longer statistically significant (β = +9.7, 95% CI -4.0 to 23.3, P 0.165). Population density was positively associated with general anaesthesia ratios (β = 8.3, P &lt;0.001) but not with the other three codes. The anaesthesiologist share was positively associated with general, epidural, continuous epidural and spinal anaesthesia (P &lt;0.001, 0.039, &lt;0.001 and 0.005, respectively). The covariate-adjusted mixed models produced optimizer-convergence warnings in Statsmodels</w:t>
-      </w:r>
-      <w:r>
-        <w:rPr>
-          <w:rFonts w:ascii="Times New Roman" w:hAnsi="Times New Roman"/>
-          <w:sz w:val="24"/>
-        </w:rPr>
-        <w:t>[14]</w:t>
-      </w:r>
-      <w:r>
-        <w:rPr>
-          <w:rFonts w:ascii="Times New Roman" w:hAnsi="Times New Roman"/>
-          <w:sz w:val="24"/>
-        </w:rPr>
-        <w:t>; we therefore refitted them with the lbfgs and cg optimisers, and the point estimates remained stable across optimisers and sensitivity analyses.</w:t>
-      </w:r>
-    </w:p>
-    <w:p>
       <w:pPr>
         <w:jc w:val="center"/>
       </w:pPr>
@@ -1747,6 +1808,134 @@
       </w:pPr>
     </w:p>
     <w:p>
+      <w:r>
+        <w:rPr>
+          <w:rFonts w:ascii="Times New Roman" w:hAnsi="Times New Roman"/>
+          <w:sz w:val="24"/>
+        </w:rPr>
+        <w:t>A covariate-adjusted sensitivity model added the natural logarithm of population density and the anaesthesiologist share of all physicians (both standardised). The university hospital coefficient was attenuated but remained positive and statistically significant for general anaesthesia (</w:t>
+      </w:r>
+      <w:r>
+        <w:rPr>
+          <w:rFonts w:ascii="Cambria Math" w:hAnsi="Cambria Math"/>
+          <w:sz w:val="24"/>
+        </w:rPr>
+        <m:oMath>
+          <m:r>
+            <m:rPr>
+              <m:sty m:val="p"/>
+            </m:rPr>
+            <m:t xml:space="preserve">β = +41.8</m:t>
+          </m:r>
+        </m:oMath>
+      </w:r>
+      <w:r>
+        <w:rPr>
+          <w:rFonts w:ascii="Times New Roman" w:hAnsi="Times New Roman"/>
+          <w:sz w:val="24"/>
+        </w:rPr>
+        <w:t>, 95% CI 32.4 to 51.2, P &lt;0.001), epidural anaesthesia (</w:t>
+      </w:r>
+      <w:r>
+        <w:rPr>
+          <w:rFonts w:ascii="Cambria Math" w:hAnsi="Cambria Math"/>
+          <w:sz w:val="24"/>
+        </w:rPr>
+        <m:oMath>
+          <m:r>
+            <m:rPr>
+              <m:sty m:val="p"/>
+            </m:rPr>
+            <m:t xml:space="preserve">β = +39.1</m:t>
+          </m:r>
+        </m:oMath>
+      </w:r>
+      <w:r>
+        <w:rPr>
+          <w:rFonts w:ascii="Times New Roman" w:hAnsi="Times New Roman"/>
+          <w:sz w:val="24"/>
+        </w:rPr>
+        <w:t>, 95% CI 14.5 to 63.7, P 0.002) and continuous epidural infusion (</w:t>
+      </w:r>
+      <w:r>
+        <w:rPr>
+          <w:rFonts w:ascii="Cambria Math" w:hAnsi="Cambria Math"/>
+          <w:sz w:val="24"/>
+        </w:rPr>
+        <m:oMath>
+          <m:r>
+            <m:rPr>
+              <m:sty m:val="p"/>
+            </m:rPr>
+            <m:t xml:space="preserve">β = +33.9</m:t>
+          </m:r>
+        </m:oMath>
+      </w:r>
+      <w:r>
+        <w:rPr>
+          <w:rFonts w:ascii="Times New Roman" w:hAnsi="Times New Roman"/>
+          <w:sz w:val="24"/>
+        </w:rPr>
+        <w:t>, 95% CI 20.0 to 47.7, P &lt;0.001). For spinal anaesthesia the point estimate was positive but no longer statistically significant (</w:t>
+      </w:r>
+      <w:r>
+        <w:rPr>
+          <w:rFonts w:ascii="Cambria Math" w:hAnsi="Cambria Math"/>
+          <w:sz w:val="24"/>
+        </w:rPr>
+        <m:oMath>
+          <m:r>
+            <m:rPr>
+              <m:sty m:val="p"/>
+            </m:rPr>
+            <m:t xml:space="preserve">β = +9.7</m:t>
+          </m:r>
+        </m:oMath>
+      </w:r>
+      <w:r>
+        <w:rPr>
+          <w:rFonts w:ascii="Times New Roman" w:hAnsi="Times New Roman"/>
+          <w:sz w:val="24"/>
+        </w:rPr>
+        <w:t>, 95% CI -4.0 to 23.3, P 0.165). Population density was positively associated with general anaesthesia ratios (</w:t>
+      </w:r>
+      <w:r>
+        <w:rPr>
+          <w:rFonts w:ascii="Cambria Math" w:hAnsi="Cambria Math"/>
+          <w:sz w:val="24"/>
+        </w:rPr>
+        <m:oMath>
+          <m:r>
+            <m:rPr>
+              <m:sty m:val="p"/>
+            </m:rPr>
+            <m:t xml:space="preserve">β = 8.3</m:t>
+          </m:r>
+        </m:oMath>
+      </w:r>
+      <w:r>
+        <w:rPr>
+          <w:rFonts w:ascii="Times New Roman" w:hAnsi="Times New Roman"/>
+          <w:sz w:val="24"/>
+        </w:rPr>
+        <w:t>, P &lt;0.001) but not with the other three codes. The anaesthesiologist share was positively associated with general, epidural, continuous epidural and spinal anaesthesia (P &lt;0.001, 0.039, &lt;0.001 and 0.005, respectively). The covariate-adjusted mixed models produced optimizer-convergence warnings in Statsmodels</w:t>
+      </w:r>
+      <w:r>
+        <w:rPr>
+          <w:rFonts w:ascii="Times New Roman" w:hAnsi="Times New Roman"/>
+          <w:sz w:val="24"/>
+        </w:rPr>
+        <w:t>[14]</w:t>
+      </w:r>
+      <w:r>
+        <w:rPr>
+          <w:rFonts w:ascii="Times New Roman" w:hAnsi="Times New Roman"/>
+          <w:sz w:val="24"/>
+        </w:rPr>
+        <w:t>; we therefore refitted them with the lbfgs and cg optimisers, and the point estimates remained stable across optimisers and sensitivity analyses.</w:t>
+      </w:r>
+    </w:p>
+    <w:p>
       <w:pPr>
         <w:spacing w:before="160" w:after="80"/>
       </w:pPr>
@@ -1765,7 +1954,49 @@
           <w:rFonts w:ascii="Times New Roman" w:hAnsi="Times New Roman"/>
           <w:sz w:val="24"/>
         </w:rPr>
-        <w:t>All pre-specified sensitivity analyses pointed away from differential auditing as the main explanation. First, the multilevel model estimates that only 0.058 of general anaesthesia variance lies between prefectures, where audit policy differs, so differential auditing can account for at most a small share of observed variation. University hospital presence explained 0.358 of total variance in the same model, a structural component far larger than the between-prefecture share. Second, general and spinal anaesthesia were positively correlated (r = 0.235, P &lt;0.001), as were general and epidural anaesthesia (r = 0.319, P &lt;0.001). Positive correlations are more consistent with a common supply-side factor than with audit-driven reclassification, although a uniform audit effect across all codes cannot be ruled out. Third, the maximum prefectural audit-rate difference of 0.28 percentage points could produce a ratio shift of approximately 0.28 points under the conservative, linear one-to-one mapping, equivalent to approximately 0.53% of the observed interquartile range for general anaesthesia and 0.27% for epidural anaesthesia. Fourth, combining general (L008) and spinal (L004) ratios produced an alternative measure that should be insensitive to miscoding between reclassifiable codes; it showed a coefficient of variation of 43.4% and a university hospital effect that remained large (Cohen's d 1.26), confirming that the structural effect is not artefactually erased by combining codes.</w:t>
+        <w:t>All pre-specified sensitivity analyses pointed away from differential auditing as the main explanation. First, the multilevel model estimates that only 0.058 of general anaesthesia variance lies between prefectures, where audit policy differs, so differential auditing can account for at most a small share of observed variation. University hospital presence explained 0.358 of total variance in the same model, a structural component far larger than the between-prefecture share. Second, general and spinal anaesthesia were positively correlated (</w:t>
+      </w:r>
+      <w:r>
+        <w:rPr>
+          <w:rFonts w:ascii="Cambria Math" w:hAnsi="Cambria Math"/>
+          <w:sz w:val="24"/>
+        </w:rPr>
+        <m:oMath>
+          <m:r>
+            <m:rPr>
+              <m:sty m:val="p"/>
+            </m:rPr>
+            <m:t xml:space="preserve">r = 0.235</m:t>
+          </m:r>
+        </m:oMath>
+      </w:r>
+      <w:r>
+        <w:rPr>
+          <w:rFonts w:ascii="Times New Roman" w:hAnsi="Times New Roman"/>
+          <w:sz w:val="24"/>
+        </w:rPr>
+        <w:t>, P &lt;0.001), as were general and epidural anaesthesia (</w:t>
+      </w:r>
+      <w:r>
+        <w:rPr>
+          <w:rFonts w:ascii="Cambria Math" w:hAnsi="Cambria Math"/>
+          <w:sz w:val="24"/>
+        </w:rPr>
+        <m:oMath>
+          <m:r>
+            <m:rPr>
+              <m:sty m:val="p"/>
+            </m:rPr>
+            <m:t xml:space="preserve">r = 0.319</m:t>
+          </m:r>
+        </m:oMath>
+      </w:r>
+      <w:r>
+        <w:rPr>
+          <w:rFonts w:ascii="Times New Roman" w:hAnsi="Times New Roman"/>
+          <w:sz w:val="24"/>
+        </w:rPr>
+        <w:t>, P &lt;0.001). Positive correlations are more consistent with a common supply-side factor than with audit-driven reclassification, although a uniform audit effect across all codes cannot be ruled out. Third, the maximum prefectural audit-rate difference of 0.28 percentage points could produce a ratio shift of approximately 0.28 points under the conservative, linear one-to-one mapping, equivalent to approximately 0.53% of the observed interquartile range for general anaesthesia and 0.27% for epidural anaesthesia. Fourth, combining general (L008) and spinal (L004) ratios produced an alternative measure that should be insensitive to miscoding between reclassifiable codes; it showed a coefficient of variation of 43.4% and a university hospital effect that remained large (Cohen's d 1.26), confirming that the structural effect is not artefactually erased by combining codes.</w:t>
       </w:r>
     </w:p>
     <w:p>
@@ -1822,7 +2053,7 @@
           <w:rFonts w:ascii="Times New Roman" w:hAnsi="Times New Roman"/>
           <w:sz w:val="24"/>
         </w:rPr>
-        <w:t>Regional variation in anaesthesia practice across Japan's 335 secondary medical areas is substantial and appears to reflect structural access factors more than prefectural auditing. University hospital presence was associated with the largest proportional reduction in total variance for general anaesthesia and a positive association in every prefecture, while the proportion of variance attributable to prefecture-level factors -- where audit intensity differs -- was small. All pre-specified sensitivity analyses pointed away from differential auditing as the main explanation. Because the outcome is a reimbursed claim ratio, the observed gradient captures service delivery rather than bedside practice directly; however, the within-prefecture structure of the data and the audit-sensitivity analyses make differential scrutiny an unlikely complete explanation. The remaining variation is therefore best interpreted as a geographic pattern in the provision of potentially beneficial anaesthesia services.</w:t>
+        <w:t>Regional variation in anaesthesia practice across Japan's 335 secondary medical areas is substantial and appears to reflect structural access factors more than prefectural auditing. University hospital presence was associated with the largest proportional reduction in total variance for general anaesthesia and a positive association in every prefecture, while the proportion of variance attributable to prefecture-level factors -- where audit intensity differs -- was small. All pre-specified sensitivity analyses pointed away from differential auditing as the main explanation. Because the outcome is a reimbursed claim ratio, the observed gradient reflects billed service delivery rather than bedside intention; however, the within-prefecture structure of the data and the audit-sensitivity analyses make differential scrutiny an unlikely complete explanation. The remaining variation is therefore best interpreted as a geographic pattern in the provision of potentially beneficial anaesthesia services.</w:t>
       </w:r>
     </w:p>
     <w:p>
@@ -2032,7 +2263,7 @@
           <w:rFonts w:ascii="Times New Roman" w:hAnsi="Times New Roman"/>
           <w:sz w:val="24"/>
         </w:rPr>
-        <w:t>Three potential policy implications follow. First, administrative claims data can be used as a surveillance tool to monitor small-area variation in perioperative care under universal coverage, but should be interpreted alongside sensitivity analyses for coding and audit effects. Second, the observed variation in epidural and continuous epidural use suggests a potential equity gap: patients' access to techniques that may improve recovery appears to depend on whether they live near a university hospital. Third, regulators may wish to focus on workforce and organisational determinants of anaesthesia service delivery rather than treating low regional ratios primarily as coding or fraud problems. The variance-decomposition framework is transferable to other procedures and to systems with a national fee schedule and regional audit variation, but the audit-specific interpretation is limited in settings where fee and insurance structures are heterogeneous.</w:t>
+        <w:t>Three potential policy implications follow. First, administrative claims data can be used as a surveillance tool to monitor small-area variation in perioperative care under universal coverage, but should be interpreted alongside sensitivity analyses for coding and audit effects. Second, the observed variation in epidural and continuous epidural use suggests a potential equity gap: patients' access to techniques that may improve recovery appears to depend on whether they live near a university hospital. Third, regulators may be better served by addressing workforce and organisational determinants of anaesthesia service delivery rather than treating low regional ratios primarily as coding or fraud issues. The variance-decomposition framework is transferable to other procedures and to systems with a national fee schedule and regional audit variation, but the audit-specific interpretation is limited in settings where fee and insurance structures are heterogeneous.</w:t>
       </w:r>
     </w:p>
     <w:p>
@@ -2054,7 +2285,7 @@
           <w:rFonts w:ascii="Times New Roman" w:hAnsi="Times New Roman"/>
           <w:sz w:val="24"/>
         </w:rPr>
-        <w:t>Regional variation in anaesthesia practice under universal coverage in Japan is substantial and appears to reflect structural access factors -- notably proximity to university hospitals -- more than prefectural claims auditing. The pattern is best interpreted as a documented-service-delivery gradient with potentially inequitable access to neuraxial techniques. In countries without universal coverage or with heterogeneous reimbursement, the audit hypothesis cannot be isolated, although the structural-access framework can be adapted if comparable data exist. Perioperative surveillance of small-area variation would benefit from separating administrative from structural sources before interpreting claims data as care variation or as coding quality.</w:t>
+        <w:t>Regional variation in anaesthesia practice under universal coverage in Japan is substantial and appears to reflect structural access factors -- notably proximity to university hospitals -- more than prefectural claims auditing. The pattern is best interpreted as a documented service-delivery gradient that reflects potentially inequitable access to neuraxial techniques. In countries without universal coverage or with heterogeneous reimbursement, the audit hypothesis cannot be isolated, although the structural-access framework can be adapted if comparable data exist. Perioperative surveillance of small-area variation would benefit from separating administrative from structural sources before interpreting claims data as care variation or a coding issue.</w:t>
       </w:r>
     </w:p>
     <w:p>
@@ -2103,7 +2334,7 @@
           <w:rFonts w:ascii="Times New Roman" w:hAnsi="Times New Roman"/>
           <w:sz w:val="24"/>
         </w:rPr>
-        <w:t>What are the implications of these findings: Administrative claims can be used as a surveillance signal for perioperative variation in universal coverage settings, but low regional ratios should prompt review of workforce and organisational access before being treated as coding or fraud problems.</w:t>
+        <w:t>What are the implications of these findings: Administrative claims can be used as a surveillance signal for perioperative variation in universal coverage settings, but low regional ratios should prompt review of workforce and organisational access before being treated as coding or fraud issues.</w:t>
       </w:r>
     </w:p>
     <w:p>

</xml_diff>

<commit_message>
Refine English phrasing and rebuild package
Co-Authored-By: Tatsuki Onishi <bougtoir@gmail.com>
</commit_message>
<xml_diff>
--- a/documents/Health_Policy/regional_anaesthesia_Health_Policy_EN.docx
+++ b/documents/Health_Policy/regional_anaesthesia_Health_Policy_EN.docx
@@ -69,7 +69,7 @@
           <w:i/>
           <w:sz w:val="24"/>
         </w:rPr>
-        <w:t>Word count (main text, excluding abstract, references, tables and figures): approximately 3428 words</w:t>
+        <w:t>Word count (main text, excluding abstract, references, tables and figures): approximately 3432 words</w:t>
       </w:r>
     </w:p>
     <w:p>
@@ -172,7 +172,7 @@
           <w:rFonts w:ascii="Times New Roman" w:hAnsi="Times New Roman"/>
           <w:sz w:val="24"/>
         </w:rPr>
-        <w:t>Methods: Cross-sectional ecological study of age- and sex-standardised claim ratios for general, spinal, epidural and continuous epidural anaesthesia across 335 secondary medical areas nested within 47 prefectures, fiscal year 2022. We fitted multilevel linear models with prefecture random intercepts and a university-hospital fixed effect, and conducted sensitivity analyses for population density, anaesthesiologist supply, log-transformed ratios and audit rates.</w:t>
+        <w:t>Methods: Cross-sectional ecological study of age- and sex-standardised claim ratios for general, spinal, epidural and continuous epidural anaesthesia across 335 secondary medical areas nested within 47 prefectures, fiscal year 2022. We fitted multilevel linear models with prefecture random intercepts and a university-hospital fixed effect, and tested robustness to population density and anaesthesiologist supply, log-transformed ratios, and an upper-bound audit-rate impact.</w:t>
       </w:r>
     </w:p>
     <w:p>
@@ -305,7 +305,7 @@
           <w:rFonts w:ascii="Times New Roman" w:hAnsi="Times New Roman"/>
           <w:sz w:val="24"/>
         </w:rPr>
-        <w:t>. If access to these techniques varies by geography, patients' probability of receiving potentially beneficial care depends on place of residence, an equity problem under universal coverage. Because the FY2022 data predate the 2026 clarification of the general-anaesthesia billing code, any coding ambiguity that existed during the study period is retained in the analysis</w:t>
+        <w:t>. If access to these techniques varies by geography, patients' probability of receiving potentially beneficial care depends on place of residence, which is an equity problem under universal coverage. Because the FY2022 data predate the 2026 clarification of the general-anaesthesia billing code, any coding ambiguity that existed during the study period is retained in the analysis</w:t>
       </w:r>
       <w:r>
         <w:rPr>
@@ -1254,7 +1254,7 @@
           <w:rFonts w:ascii="Times New Roman" w:hAnsi="Times New Roman"/>
           <w:sz w:val="24"/>
         </w:rPr>
-        <w:t>The null multilevel model showed that only 0.058 of general anaesthesia variance was attributable to the prefecture level (intraclass correlation coefficient 0.058), indicating that 94.2% occurred within prefectures where audit policy is uniform. Spinal anaesthesia showed stronger prefecture-level clustering (intraclass correlation coefficient 0.343), consistent with a greater role of prefectural factors for that code. Adding university hospital presence as a fixed effect produced the largest proportional reduction in total variance for general anaesthesia (0.358; β = +64.1, 95% confidence interval 54.8 to 73.4) and was statistically significant for every code (all P &lt; 0.001) (Table 2). A log-transformed sensitivity model yielded the same direction of association for general anaesthesia (β = 0.75, 95% CI 0.61 to 0.89, P &lt; 0.001), supporting the robustness of the linear model findings to right-skewed ratios and extreme outliers. University hospital areas had higher general anaesthesia ratios than non-university areas in 47 of 47 prefectures, with a mean within-prefecture difference of +63.3 points (t = 13.28, P &lt; 0.001) (Figure 2A). Cohen's d for the university hospital effect on general anaesthesia was 1.88; on continuous epidural infusion 1.12; on epidural anaesthesia 0.59; and on spinal anaesthesia 0.40. As a robustness check we averaged the L008 and L003 standardised claim ratios (an unweighted mean, not a clinical co-administration rate; 331 areas with data for both codes); this combined measure showed a coefficient of variation of 55.5% and preserved a large university hospital effect (Cohen's d 1.55; university mean 130.3 versus non-university 70.2) (Figure 2B).</w:t>
+        <w:t>The null multilevel model showed that only 0.058 of general anaesthesia variance was attributable to the prefecture level (intraclass correlation coefficient 0.058), indicating that 94.2% occurred within prefectures where audit policy is uniform. Spinal anaesthesia showed stronger prefecture-level clustering (intraclass correlation coefficient 0.343), consistent with a greater role of prefectural factors for that code. Adding university hospital presence as a fixed effect produced the largest proportional reduction in total variance for general anaesthesia (0.358; β = +64.1, 95% confidence interval 54.8 to 73.4) and was statistically significant for every code (all P &lt; 0.001) (Table 2). A log-transformed sensitivity model yielded the same direction of association for general anaesthesia (β = 0.75, 95% CI 0.61 to 0.89, P &lt; 0.001), supporting the robustness of the linear model findings to right-skewed ratios and extreme outliers. University hospital areas had higher general anaesthesia ratios than non-university areas in all 47 prefectures, with a mean within-prefecture difference of +63.3 points (t = 13.28, P &lt; 0.001) (Figure 2A). Cohen's d for the university hospital effect on general anaesthesia was 1.88; on continuous epidural infusion 1.12; on epidural anaesthesia 0.59; and on spinal anaesthesia 0.40. As a robustness check we averaged the L008 and L003 standardised claim ratios (an unweighted mean, not a clinical co-administration rate; 331 areas with data for both codes); this combined measure showed a coefficient of variation of 55.5% and preserved a large university hospital effect (Cohen's d 1.55; university mean 130.3 versus non-university 70.2) (Figure 2B).</w:t>
       </w:r>
     </w:p>
     <w:p>
@@ -1786,7 +1786,7 @@
           <w:rFonts w:ascii="Times New Roman" w:hAnsi="Times New Roman"/>
           <w:sz w:val="24"/>
         </w:rPr>
-        <w:t>Several lines of evidence pointed away from differential auditing as the main explanation. First, the multilevel model estimates that only 0.058 of general anaesthesia variance lies between prefectures, where audit policy differs, so differential auditing can account for at most a small share of observed variation. University hospital presence explained 0.358 of total variance in the same model, a structural component far larger than the between-prefecture share. Second, general and spinal anaesthesia were positively correlated (r = 0.235, P &lt; 0.001), as were general and epidural anaesthesia (r = 0.319, P &lt; 0.001). Positive correlations are more consistent with a common supply-side factor than with audit-driven reclassification, although a uniform audit effect across all codes cannot be ruled out. Third, the maximum prefectural audit-rate difference of 0.28 percentage points could produce a ratio shift of approximately 0.28 points under the conservative, linear one-to-one mapping, equivalent to approximately 0.53% of the observed interquartile range for general anaesthesia and 0.27% for epidural anaesthesia. Fourth, combining general (L008) and spinal (L004) ratios produced an alternative measure that should be insensitive to miscoding between reclassifiable codes; it showed a coefficient of variation of 43.4% and a university hospital effect that remained large (Cohen's d 1.26), confirming that the structural effect is not artefactually erased by combining codes.</w:t>
+        <w:t>Several lines of evidence pointed away from differential auditing as the main explanation. First, the multilevel model estimates that only 0.058 of general anaesthesia variance lies between prefectures, where audit policy differs, so differential auditing can account for at most a small share of observed variation. University hospital presence explained 0.358 of total variance in the same model, a structural component far larger than the between-prefecture share. Second, general and spinal anaesthesia were positively correlated (r = 0.235, P &lt; 0.001), as were general and epidural anaesthesia (r = 0.319, P &lt; 0.001). Positive correlations are more consistent with a common supply-side factor than with audit-driven reclassification, although a uniform audit effect across all codes cannot be ruled out. Third, the maximum prefectural audit-rate difference of 0.28 percentage points could produce a ratio shift of approximately 0.28 points under the conservative, linear one-to-one mapping, equivalent to approximately 0.53% of the observed interquartile range for general anaesthesia and 0.27% for epidural anaesthesia. Fourth, combining general (L008) and spinal (L004) ratios produced an alternative measure that should be insensitive to miscoding between reclassifiable codes; it showed a coefficient of variation of 43.4% and a university hospital effect that remained large (Cohen's d 1.26), confirming that the structural effect is not erased as an artefact by combining codes.</w:t>
       </w:r>
     </w:p>
     <w:p>
@@ -1808,7 +1808,7 @@
           <w:rFonts w:ascii="Times New Roman" w:hAnsi="Times New Roman"/>
           <w:sz w:val="24"/>
         </w:rPr>
-        <w:t>Empirical Bayes shrinkage toward prefecture means was implemented as a stress test of the area-level ratios. Under this model, shrinkage substantially compressed the area-level ratios toward their prefecture means. For general anaesthesia, Cohen's d for the university-hospital effect fell from 1.88 (raw) to 0.63 (shrunken), an attenuation of 66.5%; for epidural anaesthesia (L002) from 0.59 to 0.23 (60.6%); and for spinal anaesthesia (L004) from 0.40 to 0.04 (89.9%). The general anaesthesia effect therefore remained of moderate magnitude despite heavy shrinkage, whereas the L002 and L004 effects were materially attenuated, indicating that those smaller raw effects are more vulnerable to sampling instability. These shrinkage estimates are complementary to, and consistent in direction with, the mixed-effects model coefficients reported in Table 2, which themselves incorporate prefecture-level shrinkage. Two areas were identified as outliers (more than three standard deviations from the mean general anaesthesia ratio): Awa (Chiba) in Chiba (ratio 216.7) and central Tokyo (Tokyo) in Tokyo (ratio 435.7). Excluding outliers did not alter the direction or statistical significance of any finding.</w:t>
+        <w:t>Empirical Bayes shrinkage toward prefecture means was implemented as a stress test of the area-level ratios. Under this model, shrinkage substantially compressed the area-level ratios toward their prefecture means. For general anaesthesia, Cohen's d for the university-hospital effect fell from 1.88 (raw) to 0.63 (shrunken), an attenuation of 66.5%; for epidural anaesthesia (L002) from 0.59 to 0.23 (60.6%); and for spinal anaesthesia (L004) from 0.40 to 0.04 (89.9%). The general anaesthesia effect therefore remained moderate despite heavy shrinkage, whereas the L002 and L004 effects were materially attenuated, indicating that those smaller raw effects are more vulnerable to sampling instability. These shrinkage estimates are complementary to, and consistent in direction with, the mixed-effects model coefficients reported in Table 2, which themselves incorporate prefecture-level shrinkage. Two areas were identified as outliers (more than three standard deviations from the mean general anaesthesia ratio): Awa (Chiba) in Chiba (ratio 216.7) and central Tokyo (Tokyo) in Tokyo (ratio 435.7). Excluding outliers did not alter the direction or statistical significance of any finding.</w:t>
       </w:r>
     </w:p>
     <w:p>
@@ -1843,7 +1843,7 @@
           <w:rFonts w:ascii="Times New Roman" w:hAnsi="Times New Roman"/>
           <w:sz w:val="24"/>
         </w:rPr>
-        <w:t>Regional variation in anaesthesia practice across Japan's 335 secondary medical areas is substantial and appears to reflect structural access factors more than prefectural auditing. University hospital presence was associated with the largest proportional reduction in total variance for general anaesthesia and a positive association in every prefecture, while the proportion of variance attributable to prefecture-level factors -- where audit intensity differs -- was small. The audit-sensitivity checks and robustness analyses pointed away from differential auditing as the main explanation. Because the outcome is a reimbursed claim ratio, the observed gradient reflects billed service delivery rather than bedside intention; however, the within-prefecture structure of the data and the audit-sensitivity analyses make differential scrutiny an unlikely complete explanation. The remaining variation is therefore best interpreted as a geographic pattern in the provision of potentially beneficial anaesthesia services.</w:t>
+        <w:t>Regional variation in anaesthesia practice across Japan's 335 secondary medical areas is substantial and appears to reflect structural access factors more than prefectural auditing. University hospital presence was associated with the largest proportional reduction in total variance for general anaesthesia and a positive association in every prefecture, while the proportion of variance attributable to prefecture-level factors -- where audit intensity differs -- was small. The audit-sensitivity checks and robustness analyses pointed away from differential auditing as the main explanation. Because the outcome is a reimbursed claim ratio, the observed gradient reflects billed service delivery rather than bedside intention; however, the within-prefecture structure of the data and the audit-sensitivity analyses make it unlikely that differential scrutiny is the full explanation. The remaining variation is therefore best interpreted as a geographic pattern in the provision of potentially beneficial anaesthesia services.</w:t>
       </w:r>
     </w:p>
     <w:p>

</xml_diff>

<commit_message>
Convert ICC and variance explained prose to percentages
Co-Authored-By: Tatsuki Onishi <bougtoir@gmail.com>
</commit_message>
<xml_diff>
--- a/documents/Health_Policy/regional_anaesthesia_Health_Policy_EN.docx
+++ b/documents/Health_Policy/regional_anaesthesia_Health_Policy_EN.docx
@@ -181,7 +181,7 @@
           <w:rFonts w:ascii="Times New Roman" w:hAnsi="Times New Roman"/>
           <w:sz w:val="24"/>
         </w:rPr>
-        <w:t>Results: Coefficients of variation ranged from 53.7% to 87.2%. For general anaesthesia, only 0.058 of variance lay between prefectures; university hospital presence explained 0.358 of total variance (P &lt; 0.001). The association persisted after log transformation and covariate adjustment; audit-related ratio shifts were small relative to observed variation, supporting structural access over differential auditing.</w:t>
+        <w:t>Results: Coefficients of variation ranged from 53.7% to 87.2%. For general anaesthesia, only 5.8% of variance lay between prefectures; university hospital presence explained 35.8% of total variance (P &lt; 0.001). The association persisted after log transformation and covariate adjustment; audit-related ratio shifts were small relative to observed variation, supporting structural access over differential auditing.</w:t>
       </w:r>
     </w:p>
     <w:p>
@@ -1254,7 +1254,7 @@
           <w:rFonts w:ascii="Times New Roman" w:hAnsi="Times New Roman"/>
           <w:sz w:val="24"/>
         </w:rPr>
-        <w:t>The null multilevel model showed that only 0.058 of general anaesthesia variance was attributable to the prefecture level (intraclass correlation coefficient 0.058), indicating that 94.2% occurred within prefectures where audit policy is uniform. Spinal anaesthesia showed stronger prefecture-level clustering (intraclass correlation coefficient 0.343), consistent with a greater role of prefectural factors for that code. Adding university hospital presence as a fixed effect produced the largest proportional reduction in total variance for general anaesthesia (0.358; β = +64.1, 95% confidence interval 54.8 to 73.4) and was statistically significant for every code (all P &lt; 0.001) (Table 2). A log-transformed sensitivity model yielded the same direction of association for general anaesthesia (β = 0.75, 95% CI 0.61 to 0.89, P &lt; 0.001), supporting the robustness of the linear model findings to right-skewed ratios and extreme outliers. University hospital areas had higher general anaesthesia ratios than non-university areas in all 47 prefectures, with a mean within-prefecture difference of +63.3 points (t = 13.28, P &lt; 0.001) (Figure 2A). Cohen's d for the university hospital effect on general anaesthesia was 1.88; on continuous epidural infusion 1.12; on epidural anaesthesia 0.59; and on spinal anaesthesia 0.40. As a robustness check we averaged the L008 and L003 standardised claim ratios (an unweighted mean, not a clinical co-administration rate; 331 areas with data for both codes); this combined measure showed a coefficient of variation of 55.5% and preserved a large university hospital effect (Cohen's d 1.55; university mean 130.3 versus non-university 70.2) (Figure 2B).</w:t>
+        <w:t>The null multilevel model showed that only 5.8% of general anaesthesia variance was attributable to the prefecture level (intraclass correlation coefficient 0.058), indicating that 94.2% occurred within prefectures where audit policy is uniform. Spinal anaesthesia showed stronger prefecture-level clustering (intraclass correlation coefficient 0.343), consistent with a greater role of prefectural factors for that code. Adding university hospital presence as a fixed effect produced the largest proportional reduction in total variance for general anaesthesia (35.8%; β = +64.1, 95% confidence interval 54.8 to 73.4) and was statistically significant for every code (all P &lt; 0.001) (Table 2). A log-transformed sensitivity model yielded the same direction of association for general anaesthesia (β = 0.75, 95% CI 0.61 to 0.89, P &lt; 0.001), supporting the robustness of the linear model findings to right-skewed ratios and extreme outliers. University hospital areas had higher general anaesthesia ratios than non-university areas in all 47 prefectures, with a mean within-prefecture difference of +63.3 points (t = 13.28, P &lt; 0.001) (Figure 2A). Cohen's d for the university hospital effect on general anaesthesia was 1.88; on continuous epidural infusion 1.12; on epidural anaesthesia 0.59; and on spinal anaesthesia 0.40. As a robustness check we averaged the L008 and L003 standardised claim ratios (an unweighted mean, not a clinical co-administration rate; 331 areas with data for both codes); this combined measure showed a coefficient of variation of 55.5% and preserved a large university hospital effect (Cohen's d 1.55; university mean 130.3 versus non-university 70.2) (Figure 2B).</w:t>
       </w:r>
     </w:p>
     <w:p>
@@ -1786,7 +1786,7 @@
           <w:rFonts w:ascii="Times New Roman" w:hAnsi="Times New Roman"/>
           <w:sz w:val="24"/>
         </w:rPr>
-        <w:t>Several lines of evidence pointed away from differential auditing as the main explanation. First, the multilevel model estimates that only 0.058 of general anaesthesia variance lies between prefectures, where audit policy differs, so differential auditing can account for at most a small share of observed variation. University hospital presence explained 0.358 of total variance in the same model, a structural component far larger than the between-prefecture share. Second, general and spinal anaesthesia were positively correlated (r = 0.235, P &lt; 0.001), as were general and epidural anaesthesia (r = 0.319, P &lt; 0.001). Positive correlations are more consistent with a common supply-side factor than with audit-driven reclassification, although a uniform audit effect across all codes cannot be ruled out. Third, the maximum prefectural audit-rate difference of 0.28 percentage points could produce a ratio shift of approximately 0.28 points under the conservative, linear one-to-one mapping, equivalent to approximately 0.53% of the observed interquartile range for general anaesthesia and 0.27% for epidural anaesthesia. Fourth, combining general (L008) and spinal (L004) ratios produced an alternative measure that should be insensitive to miscoding between reclassifiable codes; it showed a coefficient of variation of 43.4% and a university hospital effect that remained large (Cohen's d 1.26), confirming that the structural effect is not erased as an artefact by combining codes.</w:t>
+        <w:t>Several lines of evidence pointed away from differential auditing as the main explanation. First, the multilevel model estimates that only 5.8% of general anaesthesia variance lies between prefectures, where audit policy differs, so differential auditing can account for at most a small share of observed variation. University hospital presence explained 35.8% of total variance in the same model, a structural component far larger than the between-prefecture share. Second, general and spinal anaesthesia were positively correlated (r = 0.235, P &lt; 0.001), as were general and epidural anaesthesia (r = 0.319, P &lt; 0.001). Positive correlations are more consistent with a common supply-side factor than with audit-driven reclassification, although a uniform audit effect across all codes cannot be ruled out. Third, the maximum prefectural audit-rate difference of 0.28 percentage points could produce a ratio shift of approximately 0.28 points under the conservative, linear one-to-one mapping, equivalent to approximately 0.53% of the observed interquartile range for general anaesthesia and 0.27% for epidural anaesthesia. Fourth, combining general (L008) and spinal (L004) ratios produced an alternative measure that should be insensitive to miscoding between reclassifiable codes; it showed a coefficient of variation of 43.4% and a university hospital effect that remained large (Cohen's d 1.26), confirming that the structural effect is not erased as an artefact by combining codes.</w:t>
       </w:r>
     </w:p>
     <w:p>

</xml_diff>